<commit_message>
docs(gdd): 修正 §18.2 中 environment.csv 的规格来源编号（10.19 -> 10.18）
上一批把「环境层」定为 §10.18 时，漏改了配置表登记行的「规格来源」列。
docx 已随之重新导出。
</commit_message>
<xml_diff>
--- a/docs/export/下课十分钟-游戏策划案-v3.1.docx
+++ b/docs/export/下课十分钟-游戏策划案-v3.1.docx
@@ -13411,7 +13411,7 @@
         <w:pStyle w:val="Heading2"/>
       </w:pPr>
       <w:r>
-        <w:t>10.19 环境层（班级级状态：音量）</w:t>
+        <w:t>10.18 环境层（班级级状态：音量）</w:t>
       </w:r>
     </w:p>
     <w:p>
@@ -23176,7 +23176,7 @@
                 <w:rFonts w:ascii="微软雅黑" w:hAnsi="微软雅黑" w:eastAsia="微软雅黑"/>
                 <w:sz w:val="18"/>
               </w:rPr>
-              <w:t>环境层：音量上限 / 适应率 / 阈值 / 系数（见 §10.19）</w:t>
+              <w:t>环境层：音量上限 / 适应率 / 阈值 / 系数（见 §10.18）</w:t>
             </w:r>
           </w:p>
         </w:tc>
@@ -23190,7 +23190,7 @@
                 <w:rFonts w:ascii="微软雅黑" w:hAnsi="微软雅黑" w:eastAsia="微软雅黑"/>
                 <w:sz w:val="18"/>
               </w:rPr>
-              <w:t>§10.19</w:t>
+              <w:t>§10.18</w:t>
             </w:r>
           </w:p>
         </w:tc>

</xml_diff>